<commit_message>
Add student flow questions for Dr. Wiltshire
</commit_message>
<xml_diff>
--- a/Questions for the ELD Team.docx
+++ b/Questions for the ELD Team.docx
@@ -1082,6 +1082,167 @@
         <w:tblLayout w:type="fixed"/>
         <w:tblLook w:firstColumn="1" w:firstRow="1" w:lastColumn="0" w:lastRow="0" w:noHBand="0" w:noVBand="1" w:val="04A0"/>
         <w:tblBorders>
+          <w:top w:val="single" w:sz="8" w:color="1B2A5C"/>
+          <w:left w:val="single" w:sz="8" w:color="1B2A5C"/>
+          <w:bottom w:val="single" w:sz="8" w:color="1B2A5C"/>
+          <w:right w:val="single" w:sz="8" w:color="1B2A5C"/>
+          <w:insideH w:val="single" w:sz="8" w:color="1B2A5C"/>
+          <w:insideV w:val="single" w:sz="8" w:color="1B2A5C"/>
+        </w:tblBorders>
+      </w:tblPr>
+      <w:tblGrid>
+        <w:gridCol w:w="5328"/>
+        <w:gridCol w:w="5328"/>
+      </w:tblGrid>
+      <w:tr>
+        <w:tc>
+          <w:tcPr>
+            <w:tcW w:type="dxa" w:w="3312"/>
+            <w:shd w:val="clear" w:color="auto" w:fill="1B2A5C"/>
+          </w:tcPr>
+          <w:p>
+            <w:pPr>
+              <w:spacing w:after="40" w:before="20"/>
+            </w:pPr>
+            <w:r/>
+            <w:r>
+              <w:rPr>
+                <w:rFonts w:ascii="Arial" w:hAnsi="Arial"/>
+                <w:b/>
+                <w:color w:val="FFFFFF"/>
+                <w:sz w:val="24"/>
+              </w:rPr>
+              <w:t>DR. WILTSHIRE</w:t>
+            </w:r>
+          </w:p>
+        </w:tc>
+        <w:tc>
+          <w:tcPr>
+            <w:tcW w:type="dxa" w:w="7344"/>
+            <w:shd w:val="clear" w:color="auto" w:fill="1B2A5C"/>
+          </w:tcPr>
+          <w:p>
+            <w:pPr>
+              <w:spacing w:after="40" w:before="20"/>
+              <w:jc w:val="right"/>
+            </w:pPr>
+            <w:r/>
+            <w:r>
+              <w:rPr>
+                <w:rFonts w:ascii="Arial" w:hAnsi="Arial"/>
+                <w:b w:val="0"/>
+                <w:color w:val="DDE0E8"/>
+                <w:sz w:val="18"/>
+              </w:rPr>
+              <w:t>course flow · fall-to-spring placement · student continuity</w:t>
+            </w:r>
+          </w:p>
+        </w:tc>
+      </w:tr>
+    </w:tbl>
+    <w:tbl>
+      <w:tblPr>
+        <w:tblW w:type="auto" w:w="0"/>
+        <w:tblLayout w:type="fixed"/>
+        <w:tblLook w:firstColumn="1" w:firstRow="1" w:lastColumn="0" w:lastRow="0" w:noHBand="0" w:noVBand="1" w:val="04A0"/>
+        <w:tblBorders>
+          <w:top w:val="single" w:sz="6" w:color="CCCCCC"/>
+          <w:left w:val="single" w:sz="6" w:color="CCCCCC"/>
+          <w:bottom w:val="single" w:sz="6" w:color="CCCCCC"/>
+          <w:right w:val="single" w:sz="6" w:color="CCCCCC"/>
+          <w:insideH w:val="single" w:sz="6" w:color="CCCCCC"/>
+          <w:insideV w:val="single" w:sz="6" w:color="CCCCCC"/>
+        </w:tblBorders>
+      </w:tblPr>
+      <w:tblGrid>
+        <w:gridCol w:w="10656"/>
+      </w:tblGrid>
+      <w:tr>
+        <w:tc>
+          <w:tcPr>
+            <w:tcW w:type="dxa" w:w="10656"/>
+            <w:shd w:val="clear" w:color="auto" w:fill="FFFFFF"/>
+          </w:tcPr>
+          <w:p>
+            <w:pPr>
+              <w:spacing w:after="60" w:before="20"/>
+            </w:pPr>
+            <w:r/>
+            <w:r>
+              <w:rPr>
+                <w:rFonts w:ascii="Arial" w:hAnsi="Arial"/>
+                <w:b/>
+                <w:color w:val="1B2A5C"/>
+                <w:sz w:val="24"/>
+              </w:rPr>
+              <w:t>“How are students flowing into the courses in fall versus spring?”</w:t>
+            </w:r>
+          </w:p>
+          <w:p>
+            <w:pPr>
+              <w:spacing w:after="60" w:before="20"/>
+            </w:pPr>
+            <w:r>
+              <w:rPr>
+                <w:rFonts w:ascii="Arial" w:hAnsi="Arial"/>
+                <w:b/>
+                <w:color w:val="2A9D8F"/>
+                <w:sz w:val="17"/>
+              </w:rPr>
+              <w:t>FOLLOW-UPS</w:t>
+            </w:r>
+          </w:p>
+          <w:p>
+            <w:pPr>
+              <w:spacing w:after="60" w:before="20"/>
+            </w:pPr>
+            <w:r>
+              <w:rPr>
+                <w:rFonts w:ascii="Arial" w:hAnsi="Arial"/>
+                <w:b w:val="0"/>
+                <w:color w:val="333333"/>
+                <w:sz w:val="18"/>
+              </w:rPr>
+              <w:t>“How are students moved from fall courses into spring courses?”</w:t>
+            </w:r>
+          </w:p>
+          <w:p>
+            <w:pPr>
+              <w:spacing w:after="60" w:before="20"/>
+            </w:pPr>
+            <w:r>
+              <w:rPr>
+                <w:rFonts w:ascii="Arial" w:hAnsi="Arial"/>
+                <w:b w:val="0"/>
+                <w:color w:val="333333"/>
+                <w:sz w:val="18"/>
+              </w:rPr>
+              <w:t>“Does Ms. Sevenbergen have the same students all year?”</w:t>
+            </w:r>
+          </w:p>
+        </w:tc>
+      </w:tr>
+    </w:tbl>
+    <w:p>
+      <w:pPr>
+        <w:spacing w:after="100" w:before="0"/>
+      </w:pPr>
+      <w:r>
+        <w:rPr>
+          <w:rFonts w:ascii="Arial" w:hAnsi="Arial"/>
+          <w:b w:val="0"/>
+          <w:i w:val="0"/>
+          <w:color w:val="333333"/>
+          <w:sz w:val="6"/>
+        </w:rPr>
+      </w:r>
+    </w:p>
+    <w:tbl>
+      <w:tblPr>
+        <w:tblW w:type="auto" w:w="0"/>
+        <w:tblLayout w:type="fixed"/>
+        <w:tblLook w:firstColumn="1" w:firstRow="1" w:lastColumn="0" w:lastRow="0" w:noHBand="0" w:noVBand="1" w:val="04A0"/>
+        <w:tblBorders>
           <w:top w:val="single" w:sz="8" w:color="2A9D8F"/>
           <w:left w:val="single" w:sz="8" w:color="2A9D8F"/>
           <w:bottom w:val="single" w:sz="8" w:color="2A9D8F"/>

</xml_diff>

<commit_message>
Add Period 1 course listing question
</commit_message>
<xml_diff>
--- a/Questions for the ELD Team.docx
+++ b/Questions for the ELD Team.docx
@@ -943,20 +943,6 @@
         </w:rPr>
       </w:r>
     </w:p>
-    <w:p>
-      <w:pPr>
-        <w:spacing w:after="120" w:before="0"/>
-      </w:pPr>
-      <w:r>
-        <w:rPr>
-          <w:rFonts w:ascii="Arial" w:hAnsi="Arial"/>
-          <w:b w:val="0"/>
-          <w:i w:val="0"/>
-          <w:color w:val="333333"/>
-          <w:sz w:val="8"/>
-        </w:rPr>
-      </w:r>
-    </w:p>
     <w:tbl>
       <w:tblPr>
         <w:tblW w:type="auto" w:w="0"/>
@@ -1059,12 +1045,27 @@
               <w:t>“Do Global Literacy and ELD/ALD classes earn credit for ELA?”</w:t>
             </w:r>
           </w:p>
+          <w:p>
+            <w:pPr>
+              <w:spacing w:after="60" w:before="20"/>
+            </w:pPr>
+            <w:r/>
+            <w:r>
+              <w:rPr>
+                <w:rFonts w:ascii="Arial" w:hAnsi="Arial"/>
+                <w:b/>
+                <w:color w:val="1B2A5C"/>
+                <w:sz w:val="24"/>
+              </w:rPr>
+              <w:t>“Why is my Period 1 class listed as UCCI Heart of Education when the CTE course should be reflected only in Period 3?”</w:t>
+            </w:r>
+          </w:p>
         </w:tc>
       </w:tr>
     </w:tbl>
     <w:p>
       <w:pPr>
-        <w:spacing w:after="100" w:before="0"/>
+        <w:spacing w:after="40" w:before="0"/>
       </w:pPr>
       <w:r>
         <w:rPr>
@@ -1072,7 +1073,7 @@
           <w:b w:val="0"/>
           <w:i w:val="0"/>
           <w:color w:val="333333"/>
-          <w:sz w:val="6"/>
+          <w:sz w:val="2"/>
         </w:rPr>
       </w:r>
     </w:p>
@@ -1225,7 +1226,7 @@
     </w:tbl>
     <w:p>
       <w:pPr>
-        <w:spacing w:after="100" w:before="0"/>
+        <w:spacing w:after="40" w:before="0"/>
       </w:pPr>
       <w:r>
         <w:rPr>
@@ -1233,7 +1234,7 @@
           <w:b w:val="0"/>
           <w:i w:val="0"/>
           <w:color w:val="333333"/>
-          <w:sz w:val="6"/>
+          <w:sz w:val="2"/>
         </w:rPr>
       </w:r>
     </w:p>

</xml_diff>

<commit_message>
Record ELA credit and placement answers
</commit_message>
<xml_diff>
--- a/Questions for the ELD Team.docx
+++ b/Questions for the ELD Team.docx
@@ -650,19 +650,6 @@
             <w:r>
               <w:rPr>
                 <w:rFonts w:ascii="Arial" w:hAnsi="Arial"/>
-                <w:b w:val="0"/>
-                <w:color w:val="333333"/>
-                <w:sz w:val="6"/>
-              </w:rPr>
-            </w:r>
-          </w:p>
-          <w:p>
-            <w:pPr>
-              <w:spacing w:after="60" w:before="20"/>
-            </w:pPr>
-            <w:r>
-              <w:rPr>
-                <w:rFonts w:ascii="Arial" w:hAnsi="Arial"/>
                 <w:b/>
                 <w:color w:val="2A9D8F"/>
                 <w:sz w:val="17"/>
@@ -682,19 +669,6 @@
                 <w:sz w:val="18"/>
               </w:rPr>
               <w:t>Every grammar teacher has a hard-won answer to this and almost nobody asks. It also directly shapes what belongs on a Daily Page versus what is a one-off worth doing once.</w:t>
-            </w:r>
-          </w:p>
-          <w:p>
-            <w:pPr>
-              <w:spacing w:after="60" w:before="20"/>
-            </w:pPr>
-            <w:r>
-              <w:rPr>
-                <w:rFonts w:ascii="Arial" w:hAnsi="Arial"/>
-                <w:b w:val="0"/>
-                <w:color w:val="333333"/>
-                <w:sz w:val="6"/>
-              </w:rPr>
             </w:r>
           </w:p>
           <w:p>
@@ -851,19 +825,6 @@
             <w:r>
               <w:rPr>
                 <w:rFonts w:ascii="Arial" w:hAnsi="Arial"/>
-                <w:b w:val="0"/>
-                <w:color w:val="333333"/>
-                <w:sz w:val="6"/>
-              </w:rPr>
-            </w:r>
-          </w:p>
-          <w:p>
-            <w:pPr>
-              <w:spacing w:after="60" w:before="20"/>
-            </w:pPr>
-            <w:r>
-              <w:rPr>
-                <w:rFonts w:ascii="Arial" w:hAnsi="Arial"/>
                 <w:b/>
                 <w:color w:val="2A9D8F"/>
                 <w:sz w:val="17"/>
@@ -883,19 +844,6 @@
                 <w:sz w:val="18"/>
               </w:rPr>
               <w:t>Program-level, which is his seat. And it names the honest risk in what we have built: if the five forms only work because one person built them, they are not a system — they are a personal practice with good documentation.</w:t>
-            </w:r>
-          </w:p>
-          <w:p>
-            <w:pPr>
-              <w:spacing w:after="60" w:before="20"/>
-            </w:pPr>
-            <w:r>
-              <w:rPr>
-                <w:rFonts w:ascii="Arial" w:hAnsi="Arial"/>
-                <w:b w:val="0"/>
-                <w:color w:val="333333"/>
-                <w:sz w:val="6"/>
-              </w:rPr>
             </w:r>
           </w:p>
           <w:p>
@@ -1049,6 +997,34 @@
             <w:pPr>
               <w:spacing w:after="60" w:before="20"/>
             </w:pPr>
+            <w:r>
+              <w:rPr>
+                <w:rFonts w:ascii="Arial" w:hAnsi="Arial"/>
+                <w:b/>
+                <w:color w:val="2A9D8F"/>
+                <w:sz w:val="17"/>
+              </w:rPr>
+              <w:t>ANSWER — FALL SEMESTER</w:t>
+            </w:r>
+          </w:p>
+          <w:p>
+            <w:pPr>
+              <w:spacing w:after="60" w:before="20"/>
+            </w:pPr>
+            <w:r>
+              <w:rPr>
+                <w:rFonts w:ascii="Arial" w:hAnsi="Arial"/>
+                <w:b w:val="0"/>
+                <w:color w:val="333333"/>
+                <w:sz w:val="18"/>
+              </w:rPr>
+              <w:t>For Matt’s fall schedule, neither ELD 1,2 (Period 1) nor ELD 3,4 (Period 2) earns ELA credit. ELD 5,6 is a separate conversation. Confirmed during the ELD Team meeting with Dr. Wiltshire present.</w:t>
+            </w:r>
+          </w:p>
+          <w:p>
+            <w:pPr>
+              <w:spacing w:after="60" w:before="20"/>
+            </w:pPr>
             <w:r/>
             <w:r>
               <w:rPr>
@@ -1177,6 +1153,34 @@
                 <w:sz w:val="24"/>
               </w:rPr>
               <w:t>“How are students flowing into the courses in fall versus spring?”</w:t>
+            </w:r>
+          </w:p>
+          <w:p>
+            <w:pPr>
+              <w:spacing w:after="60" w:before="20"/>
+            </w:pPr>
+            <w:r>
+              <w:rPr>
+                <w:rFonts w:ascii="Arial" w:hAnsi="Arial"/>
+                <w:b/>
+                <w:color w:val="2A9D8F"/>
+                <w:sz w:val="17"/>
+              </w:rPr>
+              <w:t>PLACEMENT CONTEXT</w:t>
+            </w:r>
+          </w:p>
+          <w:p>
+            <w:pPr>
+              <w:spacing w:after="60" w:before="20"/>
+            </w:pPr>
+            <w:r>
+              <w:rPr>
+                <w:rFonts w:ascii="Arial" w:hAnsi="Arial"/>
+                <w:b w:val="0"/>
+                <w:color w:val="333333"/>
+                <w:sz w:val="18"/>
+              </w:rPr>
+              <w:t>Many freshmen are entering ELD 5,6, while many sophomores are entering ELD 3,4. Initial placement is structured around students’ prior ELPAC scores. Students who still need support will move into ELD with ALD support and become LTELs.</w:t>
             </w:r>
           </w:p>
           <w:p>

</xml_diff>

<commit_message>
Record CTE pathway funding update
</commit_message>
<xml_diff>
--- a/Questions for the ELD Team.docx
+++ b/Questions for the ELD Team.docx
@@ -980,7 +980,7 @@
           </w:tcPr>
           <w:p>
             <w:pPr>
-              <w:spacing w:after="60" w:before="20"/>
+              <w:spacing w:after="0" w:before="0"/>
             </w:pPr>
             <w:r/>
             <w:r>
@@ -995,7 +995,7 @@
           </w:p>
           <w:p>
             <w:pPr>
-              <w:spacing w:after="60" w:before="20"/>
+              <w:spacing w:after="0" w:before="0"/>
             </w:pPr>
             <w:r>
               <w:rPr>
@@ -1009,7 +1009,7 @@
           </w:p>
           <w:p>
             <w:pPr>
-              <w:spacing w:after="60" w:before="20"/>
+              <w:spacing w:after="0" w:before="0"/>
             </w:pPr>
             <w:r>
               <w:rPr>
@@ -1023,7 +1023,7 @@
           </w:p>
           <w:p>
             <w:pPr>
-              <w:spacing w:after="60" w:before="20"/>
+              <w:spacing w:after="0" w:before="0"/>
             </w:pPr>
             <w:r/>
             <w:r>
@@ -1031,9 +1031,37 @@
                 <w:rFonts w:ascii="Arial" w:hAnsi="Arial"/>
                 <w:b/>
                 <w:color w:val="1B2A5C"/>
-                <w:sz w:val="24"/>
+                <w:sz w:val="22"/>
               </w:rPr>
               <w:t>“Why is my Period 1 class listed as UCCI Heart of Education when the CTE course should be reflected only in Period 3?”</w:t>
+            </w:r>
+          </w:p>
+          <w:p>
+            <w:pPr>
+              <w:spacing w:after="0" w:before="0"/>
+            </w:pPr>
+            <w:r>
+              <w:rPr>
+                <w:rFonts w:ascii="Arial" w:hAnsi="Arial"/>
+                <w:b/>
+                <w:color w:val="2A9D8F"/>
+                <w:sz w:val="17"/>
+              </w:rPr>
+              <w:t>ADMIN UPDATE — CTE PATHWAY</w:t>
+            </w:r>
+          </w:p>
+          <w:p>
+            <w:pPr>
+              <w:spacing w:after="0" w:before="0"/>
+            </w:pPr>
+            <w:r>
+              <w:rPr>
+                <w:rFonts w:ascii="Arial" w:hAnsi="Arial"/>
+                <w:b w:val="0"/>
+                <w:color w:val="333333"/>
+                <w:sz w:val="17"/>
+              </w:rPr>
+              <w:t>Students can now be recognized as CTE Education Pathway completers. This creates a potential route to future CTE funding.</w:t>
             </w:r>
           </w:p>
         </w:tc>

</xml_diff>